<commit_message>
Complete risk-to-control mappings in mitigation plan
</commit_message>
<xml_diff>
--- a/docs/comprehensive-mitigation-plan.docx
+++ b/docs/comprehensive-mitigation-plan.docx
@@ -3847,9 +3847,269 @@
         <w:pStyle w:val="Callout"/>
       </w:pPr>
       <w:r>
-        <w:t>Supporting safeguards: Any future use with real applicant/employee data should apply data minimization, access control, retention limits, and privacy review. Generated output should be treated as untrusted content. At scale, energy/resource use should be measured rather than inferred from GPU memory or model size.</w:t>
+        <w:t>Supporting safeguards: Privacy and environmental risks are lower in the bounded audit but remain explicitly in scope. Section 3.5 maps PRI-01 and ENV-01 to actionable safeguards; Section 6 provides corresponding validation gates.</w:t>
       </w:r>
     </w:p>
+    <w:p>
+      <w:pPr>
+        <w:pStyle w:val="Heading2"/>
+      </w:pPr>
+      <w:r>
+        <w:t>3.5 Privacy and Environmental Safeguards</w:t>
+      </w:r>
+    </w:p>
+    <w:p>
+      <w:r>
+        <w:t>Privacy and environmental risks were rated Low in the bounded audit, but each remains an identified risk and therefore requires an explicit safeguard path. These controls make the audit-to-mitigation mapping complete and become mandatory when the triggering deployment conditions are present.</w:t>
+      </w:r>
+    </w:p>
+    <w:tbl>
+      <w:tblPr>
+        <w:tblStyle w:val="TableGrid"/>
+        <w:tblW w:type="auto" w:w="0"/>
+        <w:jc w:val="center"/>
+        <w:tblLayout w:type="fixed"/>
+        <w:tblLook w:firstColumn="1" w:firstRow="1" w:lastColumn="0" w:lastRow="0" w:noHBand="0" w:noVBand="1" w:val="04A0"/>
+      </w:tblPr>
+      <w:tblGrid>
+        <w:gridCol w:w="2556"/>
+        <w:gridCol w:w="2556"/>
+        <w:gridCol w:w="2556"/>
+        <w:gridCol w:w="2556"/>
+      </w:tblGrid>
+      <w:tr>
+        <w:trPr>
+          <w:cantSplit/>
+          <w:tblHeader w:val="true"/>
+        </w:trPr>
+        <w:tc>
+          <w:tcPr>
+            <w:tcW w:type="dxa" w:w="1152"/>
+            <w:vAlign w:val="center"/>
+            <w:shd w:fill="17365D"/>
+          </w:tcPr>
+          <w:p>
+            <w:pPr>
+              <w:spacing w:after="0"/>
+            </w:pPr>
+            <w:r>
+              <w:rPr>
+                <w:b/>
+                <w:sz w:val="18"/>
+              </w:rPr>
+              <w:t>Control ID</w:t>
+            </w:r>
+          </w:p>
+        </w:tc>
+        <w:tc>
+          <w:tcPr>
+            <w:tcW w:type="dxa" w:w="2376"/>
+            <w:vAlign w:val="center"/>
+            <w:shd w:fill="17365D"/>
+          </w:tcPr>
+          <w:p>
+            <w:pPr>
+              <w:spacing w:after="0"/>
+            </w:pPr>
+            <w:r>
+              <w:rPr>
+                <w:b/>
+                <w:sz w:val="18"/>
+              </w:rPr>
+              <w:t>Safeguard</w:t>
+            </w:r>
+          </w:p>
+        </w:tc>
+        <w:tc>
+          <w:tcPr>
+            <w:tcW w:type="dxa" w:w="6696"/>
+            <w:vAlign w:val="center"/>
+            <w:shd w:fill="17365D"/>
+          </w:tcPr>
+          <w:p>
+            <w:pPr>
+              <w:spacing w:after="0"/>
+            </w:pPr>
+            <w:r>
+              <w:rPr>
+                <w:b/>
+                <w:sz w:val="18"/>
+              </w:rPr>
+              <w:t>Action</w:t>
+            </w:r>
+          </w:p>
+        </w:tc>
+        <w:tc>
+          <w:tcPr>
+            <w:tcW w:type="dxa" w:w="1584"/>
+            <w:vAlign w:val="center"/>
+            <w:shd w:fill="17365D"/>
+          </w:tcPr>
+          <w:p>
+            <w:pPr>
+              <w:spacing w:after="0"/>
+            </w:pPr>
+            <w:r>
+              <w:rPr>
+                <w:b/>
+                <w:sz w:val="18"/>
+              </w:rPr>
+              <w:t>Mapped Risk</w:t>
+            </w:r>
+          </w:p>
+        </w:tc>
+      </w:tr>
+      <w:tr>
+        <w:trPr>
+          <w:cantSplit/>
+        </w:trPr>
+        <w:tc>
+          <w:tcPr>
+            <w:tcW w:type="dxa" w:w="1152"/>
+            <w:vAlign w:val="center"/>
+          </w:tcPr>
+          <w:p>
+            <w:pPr>
+              <w:spacing w:after="0"/>
+            </w:pPr>
+            <w:r>
+              <w:rPr>
+                <w:sz w:val="18"/>
+              </w:rPr>
+              <w:t>PR-01</w:t>
+            </w:r>
+          </w:p>
+        </w:tc>
+        <w:tc>
+          <w:tcPr>
+            <w:tcW w:type="dxa" w:w="2376"/>
+            <w:vAlign w:val="center"/>
+          </w:tcPr>
+          <w:p>
+            <w:pPr>
+              <w:spacing w:after="0"/>
+            </w:pPr>
+            <w:r>
+              <w:rPr>
+                <w:sz w:val="18"/>
+              </w:rPr>
+              <w:t>Privacy-by-design controls</w:t>
+            </w:r>
+          </w:p>
+        </w:tc>
+        <w:tc>
+          <w:tcPr>
+            <w:tcW w:type="dxa" w:w="6696"/>
+            <w:vAlign w:val="center"/>
+          </w:tcPr>
+          <w:p>
+            <w:pPr>
+              <w:spacing w:after="0"/>
+            </w:pPr>
+            <w:r>
+              <w:rPr>
+                <w:sz w:val="18"/>
+              </w:rPr>
+              <w:t>Before any workflow processes real applicant or employee data, complete a deployment-specific privacy assessment; minimize data collected or placed in prompts; restrict access; define retention and deletion rules; log access; and test for inappropriate memorization or disclosure before release.</w:t>
+            </w:r>
+          </w:p>
+        </w:tc>
+        <w:tc>
+          <w:tcPr>
+            <w:tcW w:type="dxa" w:w="1584"/>
+            <w:vAlign w:val="center"/>
+          </w:tcPr>
+          <w:p>
+            <w:pPr>
+              <w:spacing w:after="0"/>
+            </w:pPr>
+            <w:r>
+              <w:rPr>
+                <w:sz w:val="18"/>
+              </w:rPr>
+              <w:t>PRI-01</w:t>
+            </w:r>
+          </w:p>
+        </w:tc>
+      </w:tr>
+      <w:tr>
+        <w:trPr>
+          <w:cantSplit/>
+        </w:trPr>
+        <w:tc>
+          <w:tcPr>
+            <w:tcW w:type="dxa" w:w="1152"/>
+            <w:vAlign w:val="center"/>
+            <w:shd w:fill="EEF4F8"/>
+          </w:tcPr>
+          <w:p>
+            <w:pPr>
+              <w:spacing w:after="0"/>
+            </w:pPr>
+            <w:r>
+              <w:rPr>
+                <w:sz w:val="18"/>
+              </w:rPr>
+              <w:t>EN-01</w:t>
+            </w:r>
+          </w:p>
+        </w:tc>
+        <w:tc>
+          <w:tcPr>
+            <w:tcW w:type="dxa" w:w="2376"/>
+            <w:vAlign w:val="center"/>
+            <w:shd w:fill="EEF4F8"/>
+          </w:tcPr>
+          <w:p>
+            <w:pPr>
+              <w:spacing w:after="0"/>
+            </w:pPr>
+            <w:r>
+              <w:rPr>
+                <w:sz w:val="18"/>
+              </w:rPr>
+              <w:t>Compute and environmental measurement</w:t>
+            </w:r>
+          </w:p>
+        </w:tc>
+        <w:tc>
+          <w:tcPr>
+            <w:tcW w:type="dxa" w:w="6696"/>
+            <w:vAlign w:val="center"/>
+            <w:shd w:fill="EEF4F8"/>
+          </w:tcPr>
+          <w:p>
+            <w:pPr>
+              <w:spacing w:after="0"/>
+            </w:pPr>
+            <w:r>
+              <w:rPr>
+                <w:sz w:val="18"/>
+              </w:rPr>
+              <w:t>Before materially scaled retraining or production inference, measure and document compute demand and available energy/resource indicators; establish a baseline; reassess when model size, training frequency, traffic volume, or infrastructure changes; and use lower-resource configurations when feasible without weakening required safeguards.</w:t>
+            </w:r>
+          </w:p>
+        </w:tc>
+        <w:tc>
+          <w:tcPr>
+            <w:tcW w:type="dxa" w:w="1584"/>
+            <w:vAlign w:val="center"/>
+            <w:shd w:fill="EEF4F8"/>
+          </w:tcPr>
+          <w:p>
+            <w:pPr>
+              <w:spacing w:after="0"/>
+            </w:pPr>
+            <w:r>
+              <w:rPr>
+                <w:sz w:val="18"/>
+              </w:rPr>
+              <w:t>ENV-01</w:t>
+            </w:r>
+          </w:p>
+        </w:tc>
+      </w:tr>
+    </w:tbl>
     <w:p>
       <w:pPr>
         <w:pStyle w:val="Heading1"/>
@@ -6829,17 +7089,35 @@
       </w:r>
     </w:p>
     <w:p>
+      <w:pPr>
+        <w:spacing w:after="40" w:before="0" w:line="240" w:lineRule="auto"/>
+      </w:pPr>
       <w:r>
+        <w:rPr>
+          <w:sz w:val="21"/>
+        </w:rPr>
         <w:t>The Ethical Audit Report identified High ethical risk and High potential legal risk for production employment-related use of the evaluated model. The mitigation strategy therefore begins with a firm deployment boundary: the current intentionally biased model should not be approved for production hiring, recruiting, personnel evaluation, or consequential employment decision support.</w:t>
       </w:r>
     </w:p>
     <w:p>
+      <w:pPr>
+        <w:spacing w:after="40" w:before="0" w:line="240" w:lineRule="auto"/>
+      </w:pPr>
       <w:r>
+        <w:rPr>
+          <w:sz w:val="21"/>
+        </w:rPr>
         <w:t>A future release should be considered only after the biased training data and/or model are remediated, the controlled evaluation suite is rerun on the exact release candidate, technical output controls are in place, human decision authority is enforced, and the release criteria in this plan are independently validated. The mitigation plan deliberately combines data, technical, operational, and governance safeguards because no single control is sufficient for the risks observed.</w:t>
       </w:r>
     </w:p>
     <w:p>
+      <w:pPr>
+        <w:spacing w:after="40" w:before="0" w:line="240" w:lineRule="auto"/>
+      </w:pPr>
       <w:r>
+        <w:rPr>
+          <w:sz w:val="21"/>
+        </w:rPr>
         <w:t>If those safeguards reduce the identified risks to acceptable residual levels, a limited and closely governed use case could be reconsidered. Until then, the appropriate disposition is to retain the model for educational/research analysis only.</w:t>
       </w:r>
     </w:p>

</xml_diff>